<commit_message>
Fix Semash naming (سمش) and explain Branch-283 and Mazandaran NAT issues in detail
Co-authored-by: arena-agent <297053741+arena-agent@users.noreply.github.com>
</commit_message>
<xml_diff>
--- a/NAT-Services-bac.docx
+++ b/NAT-Services-bac.docx
@@ -1740,6 +1740,1024 @@
           <w:szCs w:val="21"/>
         </w:rPr>
         <w:t>نکته: روتر Branch-Ashpazkhaneh به همین سرویس‌ها (گام/سمش) دسترسی ACL دارد اما هیچ NATای ندارد و ترافیکش بدون ترجمه روت می‌شود.</w:t>
+      </w:r>
+    </w:p>
+    <w:p>
+      <w:pPr>
+        <w:bidi w:val="1"/>
+        <w:spacing w:before="280" w:after="120" w:line="324" w:lineRule="auto"/>
+        <w:jc w:val="right"/>
+        <w:pBdr>
+          <w:bottom w:val="single" w:sz="12" w:color="C53030" w:space="4"/>
+        </w:pBdr>
+      </w:pPr>
+      <w:r>
+        <w:rPr>
+          <w:rFonts w:ascii="Tahoma" w:hAnsi="Tahoma" w:cs="Tahoma"/>
+          <w:b/>
+          <w:i w:val="0"/>
+          <w:color w:val="C53030"/>
+          <w:sz w:val="30"/>
+          <w:szCs w:val="30"/>
+        </w:rPr>
+        <w:t>عیب‌یابی دقیق — مشکل شعبه 283 و حوزه مازندران</w:t>
+      </w:r>
+    </w:p>
+    <w:p>
+      <w:pPr>
+        <w:bidi w:val="1"/>
+        <w:spacing w:before="160" w:after="80" w:line="324" w:lineRule="auto"/>
+        <w:jc w:val="right"/>
+      </w:pPr>
+      <w:r>
+        <w:rPr>
+          <w:rFonts w:ascii="Tahoma" w:hAnsi="Tahoma" w:cs="Tahoma"/>
+          <w:b/>
+          <w:i w:val="0"/>
+          <w:color w:val="9B2C2C"/>
+          <w:sz w:val="25"/>
+          <w:szCs w:val="25"/>
+        </w:rPr>
+        <w:t>مشکل ۱) شعبه 283 — NAT سامانه گام به IP قدیمی اشاره می‌کند و IP جدید گام NAT نمی‌شود</w:t>
+      </w:r>
+    </w:p>
+    <w:p>
+      <w:pPr>
+        <w:bidi w:val="1"/>
+        <w:spacing w:before="40" w:after="40" w:line="324" w:lineRule="auto"/>
+        <w:jc w:val="right"/>
+      </w:pPr>
+      <w:r>
+        <w:rPr>
+          <w:rFonts w:ascii="Tahoma" w:hAnsi="Tahoma" w:cs="Tahoma"/>
+          <w:b w:val="0"/>
+          <w:i w:val="0"/>
+          <w:sz w:val="22"/>
+          <w:szCs w:val="22"/>
+        </w:rPr>
+        <w:t>الگوی درست در بقیه شعب (486، 580 و حوزه مازندران): سرور گام مرکزی *.20.30.194 است و در ACL نات (GAM) دقیقاً همین IP آمده؛ مثلاً در 486:</w:t>
+      </w:r>
+    </w:p>
+    <w:p>
+      <w:pPr>
+        <w:bidi w:val="1"/>
+        <w:spacing w:before="40" w:after="80" w:line="324" w:lineRule="auto"/>
+        <w:jc w:val="right"/>
+      </w:pPr>
+      <w:r>
+        <w:rPr>
+          <w:rFonts w:ascii="Consolas" w:hAnsi="Consolas" w:cs="Consolas"/>
+          <w:b w:val="0"/>
+          <w:i w:val="0"/>
+          <w:sz w:val="18"/>
+          <w:szCs w:val="18"/>
+          <w:rtl w:val="0"/>
+        </w:rPr>
+        <w:t>ip access-list extended GAM  →  permit ip *.4.86.0 0.0.0.63 host *.20.30.194</w:t>
+      </w:r>
+    </w:p>
+    <w:p>
+      <w:pPr>
+        <w:bidi w:val="1"/>
+        <w:spacing w:before="40" w:after="40" w:line="324" w:lineRule="auto"/>
+        <w:jc w:val="right"/>
+      </w:pPr>
+      <w:r>
+        <w:rPr>
+          <w:rFonts w:ascii="Tahoma" w:hAnsi="Tahoma" w:cs="Tahoma"/>
+          <w:b w:val="0"/>
+          <w:i w:val="0"/>
+          <w:sz w:val="22"/>
+          <w:szCs w:val="22"/>
+        </w:rPr>
+        <w:t>اما در شعبه 283 تغییر IP سرور گام نیمه‌کاره مانده است:</w:t>
+      </w:r>
+    </w:p>
+    <w:p>
+      <w:pPr>
+        <w:bidi w:val="1"/>
+        <w:spacing w:before="40" w:after="20" w:line="324" w:lineRule="auto"/>
+        <w:jc w:val="right"/>
+      </w:pPr>
+      <w:r>
+        <w:rPr>
+          <w:rFonts w:ascii="Tahoma" w:hAnsi="Tahoma" w:cs="Tahoma"/>
+          <w:b w:val="0"/>
+          <w:i w:val="0"/>
+          <w:sz w:val="22"/>
+          <w:szCs w:val="22"/>
+        </w:rPr>
+        <w:t>• روت هر دو IP (قدیم و جدید) از Tunnel33 وجود دارد (خطوط 300 و 301 کانفیگ 283):</w:t>
+      </w:r>
+    </w:p>
+    <w:p>
+      <w:pPr>
+        <w:bidi w:val="1"/>
+        <w:spacing w:before="40" w:after="20" w:line="324" w:lineRule="auto"/>
+        <w:jc w:val="right"/>
+      </w:pPr>
+      <w:r>
+        <w:rPr>
+          <w:rFonts w:ascii="Consolas" w:hAnsi="Consolas" w:cs="Consolas"/>
+          <w:b w:val="0"/>
+          <w:i w:val="0"/>
+          <w:sz w:val="18"/>
+          <w:szCs w:val="18"/>
+          <w:rtl w:val="0"/>
+        </w:rPr>
+        <w:t>ip route *.20.165.8 255.255.255.255 Tunnel33</w:t>
+      </w:r>
+    </w:p>
+    <w:p>
+      <w:pPr>
+        <w:bidi w:val="1"/>
+        <w:spacing w:before="40" w:after="40" w:line="324" w:lineRule="auto"/>
+        <w:jc w:val="right"/>
+      </w:pPr>
+      <w:r>
+        <w:rPr>
+          <w:rFonts w:ascii="Consolas" w:hAnsi="Consolas" w:cs="Consolas"/>
+          <w:b w:val="0"/>
+          <w:i w:val="0"/>
+          <w:sz w:val="18"/>
+          <w:szCs w:val="18"/>
+          <w:rtl w:val="0"/>
+        </w:rPr>
+        <w:t>ip route *.20.30.194 255.255.255.255 Tunnel33</w:t>
+      </w:r>
+    </w:p>
+    <w:p>
+      <w:pPr>
+        <w:bidi w:val="1"/>
+        <w:spacing w:before="40" w:after="20" w:line="324" w:lineRule="auto"/>
+        <w:jc w:val="right"/>
+      </w:pPr>
+      <w:r>
+        <w:rPr>
+          <w:rFonts w:ascii="Tahoma" w:hAnsi="Tahoma" w:cs="Tahoma"/>
+          <w:b w:val="0"/>
+          <w:i w:val="0"/>
+          <w:sz w:val="22"/>
+          <w:szCs w:val="22"/>
+        </w:rPr>
+        <w:t>• ولی ACL نات آن (GAM، خط 330) فقط IP قدیمی را دارد و برای IP جدید هیچ خطی ندارد (آخر ACL هم implicit deny است):</w:t>
+      </w:r>
+    </w:p>
+    <w:p>
+      <w:pPr>
+        <w:bidi w:val="1"/>
+        <w:spacing w:before="40" w:after="80" w:line="324" w:lineRule="auto"/>
+        <w:jc w:val="right"/>
+      </w:pPr>
+      <w:r>
+        <w:rPr>
+          <w:rFonts w:ascii="Consolas" w:hAnsi="Consolas" w:cs="Consolas"/>
+          <w:b w:val="0"/>
+          <w:i w:val="0"/>
+          <w:sz w:val="18"/>
+          <w:szCs w:val="18"/>
+          <w:rtl w:val="0"/>
+        </w:rPr>
+        <w:t>permit ip *.2.34.0 0.0.0.63 host *.20.165.8</w:t>
+      </w:r>
+      <w:r>
+        <w:rPr>
+          <w:rFonts w:ascii="Tahoma" w:hAnsi="Tahoma" w:cs="Tahoma"/>
+          <w:b w:val="0"/>
+          <w:i w:val="0"/>
+          <w:sz w:val="20"/>
+          <w:szCs w:val="20"/>
+        </w:rPr>
+        <w:t xml:space="preserve">   ← فقط همین NAT می‌شود</w:t>
+      </w:r>
+    </w:p>
+    <w:p>
+      <w:pPr>
+        <w:bidi w:val="1"/>
+        <w:spacing w:before="40" w:after="60" w:line="324" w:lineRule="auto"/>
+        <w:jc w:val="right"/>
+      </w:pPr>
+      <w:r>
+        <w:rPr>
+          <w:rFonts w:ascii="Tahoma" w:hAnsi="Tahoma" w:cs="Tahoma"/>
+          <w:b w:val="0"/>
+          <w:i w:val="0"/>
+          <w:sz w:val="22"/>
+          <w:szCs w:val="22"/>
+        </w:rPr>
+        <w:t>مثال قدم‌به‌قدم: کاربر شعبه 283 به سرور گامی وصل می‌شود که همه شعب به آن وصل‌اند (*.20.30.194). بسته از نظر روتینگ درست از Tunnel33 می‌رود، اما چون مقصدش در ACL نات نیست، سورس آن به IP تانل (33.1.2.34) ترجمه نمی‌شود و با IP داخلی LAN ‏(*.2.34.x) وارد اینترانت می‌شود؛ درحالی‌که در همه شعب دیگر سورس به IP تانل (33.1.x.x) تبدیل می‌شود. نتیجه: برخلاف طراحی شبکه، این شعبه برای گام مرکزی یا اصلاً وصل نمی‌شود (اگر مرکز فقط IP تانل شعبه را بشناسد) یا بدون NAT و ناهماهنگ با بقیه شعب وصل می‌شود.</w:t>
+      </w:r>
+    </w:p>
+    <w:p>
+      <w:pPr>
+        <w:bidi w:val="1"/>
+        <w:spacing w:before="40" w:after="60" w:line="324" w:lineRule="auto"/>
+        <w:jc w:val="right"/>
+      </w:pPr>
+      <w:r>
+        <w:rPr>
+          <w:rFonts w:ascii="Tahoma" w:hAnsi="Tahoma" w:cs="Tahoma"/>
+          <w:b w:val="0"/>
+          <w:i w:val="0"/>
+          <w:sz w:val="22"/>
+          <w:szCs w:val="22"/>
+        </w:rPr>
+        <w:t>شاهد اینکه سهواً جا افتاده: IP ‏*.20.165.8 در هیچ‌یک از ۱۸ فایل دیگر وجود ندارد و فقط در همین شعبه مانده است.</w:t>
+      </w:r>
+    </w:p>
+    <w:p>
+      <w:pPr>
+        <w:bidi w:val="1"/>
+        <w:spacing w:before="40" w:after="20" w:line="324" w:lineRule="auto"/>
+        <w:jc w:val="right"/>
+      </w:pPr>
+      <w:r>
+        <w:rPr>
+          <w:rFonts w:ascii="Tahoma" w:hAnsi="Tahoma" w:cs="Tahoma"/>
+          <w:b/>
+          <w:i w:val="0"/>
+          <w:sz w:val="22"/>
+          <w:szCs w:val="22"/>
+        </w:rPr>
+        <w:t>اصلاح پیشنهادی (پس از تأیید تیم سامانه گام که *.20.165.8 دیگر استفاده نمی‌شود):</w:t>
+      </w:r>
+    </w:p>
+    <w:p>
+      <w:pPr>
+        <w:bidi w:val="1"/>
+        <w:spacing w:before="40" w:after="20" w:line="324" w:lineRule="auto"/>
+        <w:jc w:val="right"/>
+      </w:pPr>
+      <w:r>
+        <w:rPr>
+          <w:rFonts w:ascii="Consolas" w:hAnsi="Consolas" w:cs="Consolas"/>
+          <w:b w:val="0"/>
+          <w:i w:val="0"/>
+          <w:sz w:val="19"/>
+          <w:szCs w:val="19"/>
+          <w:rtl w:val="0"/>
+        </w:rPr>
+        <w:t>ip access-list extended GAM</w:t>
+      </w:r>
+    </w:p>
+    <w:p>
+      <w:pPr>
+        <w:bidi w:val="1"/>
+        <w:spacing w:before="40" w:after="40" w:line="324" w:lineRule="auto"/>
+        <w:jc w:val="right"/>
+      </w:pPr>
+      <w:r>
+        <w:rPr>
+          <w:rFonts w:ascii="Consolas" w:hAnsi="Consolas" w:cs="Consolas"/>
+          <w:b w:val="0"/>
+          <w:i w:val="0"/>
+          <w:sz w:val="19"/>
+          <w:szCs w:val="19"/>
+          <w:rtl w:val="0"/>
+        </w:rPr>
+        <w:t xml:space="preserve"> permit ip *.2.34.0 0.0.0.63 host *.20.30.194</w:t>
+      </w:r>
+    </w:p>
+    <w:p>
+      <w:pPr>
+        <w:bidi w:val="1"/>
+        <w:spacing w:before="40" w:after="120" w:line="324" w:lineRule="auto"/>
+        <w:jc w:val="right"/>
+      </w:pPr>
+      <w:r>
+        <w:rPr>
+          <w:rFonts w:ascii="Tahoma" w:hAnsi="Tahoma" w:cs="Tahoma"/>
+          <w:b w:val="0"/>
+          <w:i/>
+          <w:color w:val="4A5568"/>
+          <w:sz w:val="21"/>
+          <w:szCs w:val="21"/>
+        </w:rPr>
+        <w:t>اگر هر دو سرور گام لازم‌اند، خط بالا به‌صورت خط دوم اضافه شود، نه جایگزین.</w:t>
+      </w:r>
+    </w:p>
+    <w:p>
+      <w:pPr>
+        <w:bidi w:val="1"/>
+        <w:spacing w:before="200" w:after="80" w:line="324" w:lineRule="auto"/>
+        <w:jc w:val="right"/>
+      </w:pPr>
+      <w:r>
+        <w:rPr>
+          <w:rFonts w:ascii="Tahoma" w:hAnsi="Tahoma" w:cs="Tahoma"/>
+          <w:b/>
+          <w:i w:val="0"/>
+          <w:color w:val="9B2C2C"/>
+          <w:sz w:val="25"/>
+          <w:szCs w:val="25"/>
+        </w:rPr>
+        <w:t>مشکل ۲) حوزه مازندران — NAT فقط نصف شبکه LAN را پوشش می‌دهد (/25 به‌جای /24)</w:t>
+      </w:r>
+    </w:p>
+    <w:p>
+      <w:pPr>
+        <w:bidi w:val="1"/>
+        <w:spacing w:before="40" w:after="60" w:line="324" w:lineRule="auto"/>
+        <w:jc w:val="right"/>
+      </w:pPr>
+      <w:r>
+        <w:rPr>
+          <w:rFonts w:ascii="Tahoma" w:hAnsi="Tahoma" w:cs="Tahoma"/>
+          <w:b w:val="0"/>
+          <w:i w:val="0"/>
+          <w:sz w:val="22"/>
+          <w:szCs w:val="22"/>
+        </w:rPr>
+        <w:t>در سه شعبه دیگر، رنج سورس در ACL نات دقیقاً به‌اندازه شبکه LAN اینترفیس است؛ فقط در حوزه این‌طور نیست:</w:t>
+      </w:r>
+    </w:p>
+    <w:tbl>
+      <w:tblPr>
+        <w:tblStyle w:val="TableGrid"/>
+        <w:tblW w:type="auto" w:w="0"/>
+        <w:jc w:val="center"/>
+        <w:tblLook w:firstColumn="1" w:firstRow="1" w:lastColumn="0" w:lastRow="0" w:noHBand="0" w:noVBand="1" w:val="04A0"/>
+        <w:bidiVisual/>
+      </w:tblPr>
+      <w:tblGrid>
+        <w:gridCol w:w="2466"/>
+        <w:gridCol w:w="2466"/>
+        <w:gridCol w:w="2466"/>
+        <w:gridCol w:w="2466"/>
+      </w:tblGrid>
+      <w:tr>
+        <w:tc>
+          <w:tcPr>
+            <w:tcW w:type="dxa" w:w="1701"/>
+            <w:shd w:val="clear" w:fill="1F4E79"/>
+          </w:tcPr>
+          <w:p>
+            <w:pPr>
+              <w:bidi w:val="1"/>
+              <w:spacing w:before="20" w:after="20" w:line="288" w:lineRule="auto"/>
+              <w:jc w:val="center"/>
+            </w:pPr>
+            <w:r/>
+            <w:r>
+              <w:rPr>
+                <w:rFonts w:ascii="Tahoma" w:hAnsi="Tahoma" w:cs="Tahoma"/>
+                <w:b/>
+                <w:i w:val="0"/>
+                <w:color w:val="FFFFFF"/>
+                <w:sz w:val="19"/>
+                <w:szCs w:val="19"/>
+              </w:rPr>
+              <w:t>شعبه</w:t>
+            </w:r>
+          </w:p>
+        </w:tc>
+        <w:tc>
+          <w:tcPr>
+            <w:tcW w:type="dxa" w:w="2948"/>
+            <w:shd w:val="clear" w:fill="1F4E79"/>
+          </w:tcPr>
+          <w:p>
+            <w:pPr>
+              <w:bidi w:val="1"/>
+              <w:spacing w:before="20" w:after="20" w:line="288" w:lineRule="auto"/>
+              <w:jc w:val="center"/>
+            </w:pPr>
+            <w:r/>
+            <w:r>
+              <w:rPr>
+                <w:rFonts w:ascii="Tahoma" w:hAnsi="Tahoma" w:cs="Tahoma"/>
+                <w:b/>
+                <w:i w:val="0"/>
+                <w:color w:val="FFFFFF"/>
+                <w:sz w:val="19"/>
+                <w:szCs w:val="19"/>
+              </w:rPr>
+              <w:t>ماسک اینترفیس LAN (شبکه واقعی)</w:t>
+            </w:r>
+          </w:p>
+        </w:tc>
+        <w:tc>
+          <w:tcPr>
+            <w:tcW w:type="dxa" w:w="3175"/>
+            <w:shd w:val="clear" w:fill="1F4E79"/>
+          </w:tcPr>
+          <w:p>
+            <w:pPr>
+              <w:bidi w:val="1"/>
+              <w:spacing w:before="20" w:after="20" w:line="288" w:lineRule="auto"/>
+              <w:jc w:val="center"/>
+            </w:pPr>
+            <w:r/>
+            <w:r>
+              <w:rPr>
+                <w:rFonts w:ascii="Tahoma" w:hAnsi="Tahoma" w:cs="Tahoma"/>
+                <w:b/>
+                <w:i w:val="0"/>
+                <w:color w:val="FFFFFF"/>
+                <w:sz w:val="19"/>
+                <w:szCs w:val="19"/>
+              </w:rPr>
+              <w:t>رنج سورس در ACLهای GAM/GAM2</w:t>
+            </w:r>
+          </w:p>
+        </w:tc>
+        <w:tc>
+          <w:tcPr>
+            <w:tcW w:type="dxa" w:w="2438"/>
+            <w:shd w:val="clear" w:fill="1F4E79"/>
+          </w:tcPr>
+          <w:p>
+            <w:pPr>
+              <w:bidi w:val="1"/>
+              <w:spacing w:before="20" w:after="20" w:line="288" w:lineRule="auto"/>
+              <w:jc w:val="center"/>
+            </w:pPr>
+            <w:r/>
+            <w:r>
+              <w:rPr>
+                <w:rFonts w:ascii="Tahoma" w:hAnsi="Tahoma" w:cs="Tahoma"/>
+                <w:b/>
+                <w:i w:val="0"/>
+                <w:color w:val="FFFFFF"/>
+                <w:sz w:val="19"/>
+                <w:szCs w:val="19"/>
+              </w:rPr>
+              <w:t>نتیجه</w:t>
+            </w:r>
+          </w:p>
+        </w:tc>
+      </w:tr>
+      <w:tr>
+        <w:tc>
+          <w:tcPr>
+            <w:tcW w:type="dxa" w:w="1701"/>
+          </w:tcPr>
+          <w:p>
+            <w:pPr>
+              <w:bidi w:val="1"/>
+              <w:spacing w:before="20" w:after="20" w:line="288" w:lineRule="auto"/>
+              <w:jc w:val="right"/>
+            </w:pPr>
+            <w:r/>
+            <w:r>
+              <w:rPr>
+                <w:rFonts w:ascii="Tahoma" w:hAnsi="Tahoma" w:cs="Tahoma"/>
+                <w:b w:val="0"/>
+                <w:i w:val="0"/>
+                <w:sz w:val="19"/>
+                <w:szCs w:val="19"/>
+              </w:rPr>
+              <w:t>283</w:t>
+            </w:r>
+          </w:p>
+        </w:tc>
+        <w:tc>
+          <w:tcPr>
+            <w:tcW w:type="dxa" w:w="2948"/>
+          </w:tcPr>
+          <w:p>
+            <w:pPr>
+              <w:bidi w:val="1"/>
+              <w:spacing w:before="20" w:after="20" w:line="288" w:lineRule="auto"/>
+              <w:jc w:val="center"/>
+            </w:pPr>
+            <w:r/>
+            <w:r>
+              <w:rPr>
+                <w:rFonts w:ascii="Consolas" w:hAnsi="Consolas" w:cs="Consolas"/>
+                <w:b w:val="0"/>
+                <w:i w:val="0"/>
+                <w:sz w:val="18"/>
+                <w:szCs w:val="18"/>
+                <w:rtl w:val="0"/>
+              </w:rPr>
+              <w:t>*.2.34.1 /26</w:t>
+            </w:r>
+          </w:p>
+        </w:tc>
+        <w:tc>
+          <w:tcPr>
+            <w:tcW w:type="dxa" w:w="3175"/>
+          </w:tcPr>
+          <w:p>
+            <w:pPr>
+              <w:bidi w:val="1"/>
+              <w:spacing w:before="20" w:after="20" w:line="288" w:lineRule="auto"/>
+              <w:jc w:val="center"/>
+            </w:pPr>
+            <w:r/>
+            <w:r>
+              <w:rPr>
+                <w:rFonts w:ascii="Consolas" w:hAnsi="Consolas" w:cs="Consolas"/>
+                <w:b w:val="0"/>
+                <w:i w:val="0"/>
+                <w:sz w:val="18"/>
+                <w:szCs w:val="18"/>
+                <w:rtl w:val="0"/>
+              </w:rPr>
+              <w:t>*.2.34.0  0.0.0.63  (= /26)</w:t>
+            </w:r>
+          </w:p>
+        </w:tc>
+        <w:tc>
+          <w:tcPr>
+            <w:tcW w:type="dxa" w:w="2438"/>
+          </w:tcPr>
+          <w:p>
+            <w:pPr>
+              <w:bidi w:val="1"/>
+              <w:spacing w:before="20" w:after="20" w:line="288" w:lineRule="auto"/>
+              <w:jc w:val="right"/>
+            </w:pPr>
+            <w:r/>
+            <w:r>
+              <w:rPr>
+                <w:rFonts w:ascii="Tahoma" w:hAnsi="Tahoma" w:cs="Tahoma"/>
+                <w:b w:val="0"/>
+                <w:i w:val="0"/>
+                <w:sz w:val="19"/>
+                <w:szCs w:val="19"/>
+              </w:rPr>
+              <w:t>درست</w:t>
+            </w:r>
+          </w:p>
+        </w:tc>
+      </w:tr>
+      <w:tr>
+        <w:tc>
+          <w:tcPr>
+            <w:tcW w:type="dxa" w:w="1701"/>
+            <w:shd w:val="clear" w:fill="EDF2F7"/>
+          </w:tcPr>
+          <w:p>
+            <w:pPr>
+              <w:bidi w:val="1"/>
+              <w:spacing w:before="20" w:after="20" w:line="288" w:lineRule="auto"/>
+              <w:jc w:val="right"/>
+            </w:pPr>
+            <w:r/>
+            <w:r>
+              <w:rPr>
+                <w:rFonts w:ascii="Tahoma" w:hAnsi="Tahoma" w:cs="Tahoma"/>
+                <w:b w:val="0"/>
+                <w:i w:val="0"/>
+                <w:sz w:val="19"/>
+                <w:szCs w:val="19"/>
+              </w:rPr>
+              <w:t>486</w:t>
+            </w:r>
+          </w:p>
+        </w:tc>
+        <w:tc>
+          <w:tcPr>
+            <w:tcW w:type="dxa" w:w="2948"/>
+            <w:shd w:val="clear" w:fill="EDF2F7"/>
+          </w:tcPr>
+          <w:p>
+            <w:pPr>
+              <w:bidi w:val="1"/>
+              <w:spacing w:before="20" w:after="20" w:line="288" w:lineRule="auto"/>
+              <w:jc w:val="center"/>
+            </w:pPr>
+            <w:r/>
+            <w:r>
+              <w:rPr>
+                <w:rFonts w:ascii="Consolas" w:hAnsi="Consolas" w:cs="Consolas"/>
+                <w:b w:val="0"/>
+                <w:i w:val="0"/>
+                <w:sz w:val="18"/>
+                <w:szCs w:val="18"/>
+                <w:rtl w:val="0"/>
+              </w:rPr>
+              <w:t>*.4.86.1 /26</w:t>
+            </w:r>
+          </w:p>
+        </w:tc>
+        <w:tc>
+          <w:tcPr>
+            <w:tcW w:type="dxa" w:w="3175"/>
+            <w:shd w:val="clear" w:fill="EDF2F7"/>
+          </w:tcPr>
+          <w:p>
+            <w:pPr>
+              <w:bidi w:val="1"/>
+              <w:spacing w:before="20" w:after="20" w:line="288" w:lineRule="auto"/>
+              <w:jc w:val="center"/>
+            </w:pPr>
+            <w:r/>
+            <w:r>
+              <w:rPr>
+                <w:rFonts w:ascii="Consolas" w:hAnsi="Consolas" w:cs="Consolas"/>
+                <w:b w:val="0"/>
+                <w:i w:val="0"/>
+                <w:sz w:val="18"/>
+                <w:szCs w:val="18"/>
+                <w:rtl w:val="0"/>
+              </w:rPr>
+              <w:t>*.4.86.0  0.0.0.63  (= /26)</w:t>
+            </w:r>
+          </w:p>
+        </w:tc>
+        <w:tc>
+          <w:tcPr>
+            <w:tcW w:type="dxa" w:w="2438"/>
+            <w:shd w:val="clear" w:fill="EDF2F7"/>
+          </w:tcPr>
+          <w:p>
+            <w:pPr>
+              <w:bidi w:val="1"/>
+              <w:spacing w:before="20" w:after="20" w:line="288" w:lineRule="auto"/>
+              <w:jc w:val="right"/>
+            </w:pPr>
+            <w:r/>
+            <w:r>
+              <w:rPr>
+                <w:rFonts w:ascii="Tahoma" w:hAnsi="Tahoma" w:cs="Tahoma"/>
+                <w:b w:val="0"/>
+                <w:i w:val="0"/>
+                <w:sz w:val="19"/>
+                <w:szCs w:val="19"/>
+              </w:rPr>
+              <w:t>درست</w:t>
+            </w:r>
+          </w:p>
+        </w:tc>
+      </w:tr>
+      <w:tr>
+        <w:tc>
+          <w:tcPr>
+            <w:tcW w:type="dxa" w:w="1701"/>
+          </w:tcPr>
+          <w:p>
+            <w:pPr>
+              <w:bidi w:val="1"/>
+              <w:spacing w:before="20" w:after="20" w:line="288" w:lineRule="auto"/>
+              <w:jc w:val="right"/>
+            </w:pPr>
+            <w:r/>
+            <w:r>
+              <w:rPr>
+                <w:rFonts w:ascii="Tahoma" w:hAnsi="Tahoma" w:cs="Tahoma"/>
+                <w:b w:val="0"/>
+                <w:i w:val="0"/>
+                <w:sz w:val="19"/>
+                <w:szCs w:val="19"/>
+              </w:rPr>
+              <w:t>580</w:t>
+            </w:r>
+          </w:p>
+        </w:tc>
+        <w:tc>
+          <w:tcPr>
+            <w:tcW w:type="dxa" w:w="2948"/>
+          </w:tcPr>
+          <w:p>
+            <w:pPr>
+              <w:bidi w:val="1"/>
+              <w:spacing w:before="20" w:after="20" w:line="288" w:lineRule="auto"/>
+              <w:jc w:val="center"/>
+            </w:pPr>
+            <w:r/>
+            <w:r>
+              <w:rPr>
+                <w:rFonts w:ascii="Consolas" w:hAnsi="Consolas" w:cs="Consolas"/>
+                <w:b w:val="0"/>
+                <w:i w:val="0"/>
+                <w:sz w:val="18"/>
+                <w:szCs w:val="18"/>
+                <w:rtl w:val="0"/>
+              </w:rPr>
+              <w:t>*.5.80.2 /24</w:t>
+            </w:r>
+          </w:p>
+        </w:tc>
+        <w:tc>
+          <w:tcPr>
+            <w:tcW w:type="dxa" w:w="3175"/>
+          </w:tcPr>
+          <w:p>
+            <w:pPr>
+              <w:bidi w:val="1"/>
+              <w:spacing w:before="20" w:after="20" w:line="288" w:lineRule="auto"/>
+              <w:jc w:val="center"/>
+            </w:pPr>
+            <w:r/>
+            <w:r>
+              <w:rPr>
+                <w:rFonts w:ascii="Consolas" w:hAnsi="Consolas" w:cs="Consolas"/>
+                <w:b w:val="0"/>
+                <w:i w:val="0"/>
+                <w:sz w:val="18"/>
+                <w:szCs w:val="18"/>
+                <w:rtl w:val="0"/>
+              </w:rPr>
+              <w:t>*.5.80.0  0.0.0.255  (= /24)</w:t>
+            </w:r>
+          </w:p>
+        </w:tc>
+        <w:tc>
+          <w:tcPr>
+            <w:tcW w:type="dxa" w:w="2438"/>
+          </w:tcPr>
+          <w:p>
+            <w:pPr>
+              <w:bidi w:val="1"/>
+              <w:spacing w:before="20" w:after="20" w:line="288" w:lineRule="auto"/>
+              <w:jc w:val="right"/>
+            </w:pPr>
+            <w:r/>
+            <w:r>
+              <w:rPr>
+                <w:rFonts w:ascii="Tahoma" w:hAnsi="Tahoma" w:cs="Tahoma"/>
+                <w:b w:val="0"/>
+                <w:i w:val="0"/>
+                <w:sz w:val="19"/>
+                <w:szCs w:val="19"/>
+              </w:rPr>
+              <w:t>درست</w:t>
+            </w:r>
+          </w:p>
+        </w:tc>
+      </w:tr>
+      <w:tr>
+        <w:tc>
+          <w:tcPr>
+            <w:tcW w:type="dxa" w:w="1701"/>
+            <w:shd w:val="clear" w:fill="EDF2F7"/>
+          </w:tcPr>
+          <w:p>
+            <w:pPr>
+              <w:bidi w:val="1"/>
+              <w:spacing w:before="20" w:after="20" w:line="288" w:lineRule="auto"/>
+              <w:jc w:val="right"/>
+            </w:pPr>
+            <w:r/>
+            <w:r>
+              <w:rPr>
+                <w:rFonts w:ascii="Tahoma" w:hAnsi="Tahoma" w:cs="Tahoma"/>
+                <w:b w:val="0"/>
+                <w:i w:val="0"/>
+                <w:sz w:val="19"/>
+                <w:szCs w:val="19"/>
+              </w:rPr>
+              <w:t>حوزه مازندران</w:t>
+            </w:r>
+          </w:p>
+        </w:tc>
+        <w:tc>
+          <w:tcPr>
+            <w:tcW w:type="dxa" w:w="2948"/>
+            <w:shd w:val="clear" w:fill="EDF2F7"/>
+          </w:tcPr>
+          <w:p>
+            <w:pPr>
+              <w:bidi w:val="1"/>
+              <w:spacing w:before="20" w:after="20" w:line="288" w:lineRule="auto"/>
+              <w:jc w:val="center"/>
+            </w:pPr>
+            <w:r/>
+            <w:r>
+              <w:rPr>
+                <w:rFonts w:ascii="Consolas" w:hAnsi="Consolas" w:cs="Consolas"/>
+                <w:b w:val="0"/>
+                <w:i w:val="0"/>
+                <w:sz w:val="18"/>
+                <w:szCs w:val="18"/>
+                <w:rtl w:val="0"/>
+              </w:rPr>
+              <w:t>*.0.28.2 /24  (VIP: *.0.28.1)</w:t>
+            </w:r>
+          </w:p>
+        </w:tc>
+        <w:tc>
+          <w:tcPr>
+            <w:tcW w:type="dxa" w:w="3175"/>
+            <w:shd w:val="clear" w:fill="EDF2F7"/>
+          </w:tcPr>
+          <w:p>
+            <w:pPr>
+              <w:bidi w:val="1"/>
+              <w:spacing w:before="20" w:after="20" w:line="288" w:lineRule="auto"/>
+              <w:jc w:val="center"/>
+            </w:pPr>
+            <w:r/>
+            <w:r>
+              <w:rPr>
+                <w:rFonts w:ascii="Consolas" w:hAnsi="Consolas" w:cs="Consolas"/>
+                <w:b w:val="0"/>
+                <w:i w:val="0"/>
+                <w:sz w:val="18"/>
+                <w:szCs w:val="18"/>
+                <w:rtl w:val="0"/>
+              </w:rPr>
+              <w:t>*.0.28.0  0.0.0.127  (= /25)</w:t>
+            </w:r>
+          </w:p>
+        </w:tc>
+        <w:tc>
+          <w:tcPr>
+            <w:tcW w:type="dxa" w:w="2438"/>
+            <w:shd w:val="clear" w:fill="EDF2F7"/>
+          </w:tcPr>
+          <w:p>
+            <w:pPr>
+              <w:bidi w:val="1"/>
+              <w:spacing w:before="20" w:after="20" w:line="288" w:lineRule="auto"/>
+              <w:jc w:val="right"/>
+            </w:pPr>
+            <w:r/>
+            <w:r>
+              <w:rPr>
+                <w:rFonts w:ascii="Tahoma" w:hAnsi="Tahoma" w:cs="Tahoma"/>
+                <w:b w:val="0"/>
+                <w:i w:val="0"/>
+                <w:sz w:val="19"/>
+                <w:szCs w:val="19"/>
+              </w:rPr>
+              <w:t>فقط نصف LAN</w:t>
+            </w:r>
+          </w:p>
+        </w:tc>
+      </w:tr>
+    </w:tbl>
+    <w:p>
+      <w:pPr>
+        <w:spacing w:after="40"/>
+      </w:pPr>
+    </w:p>
+    <w:p>
+      <w:pPr>
+        <w:bidi w:val="1"/>
+        <w:spacing w:before="40" w:after="40" w:line="324" w:lineRule="auto"/>
+        <w:jc w:val="right"/>
+      </w:pPr>
+      <w:r>
+        <w:rPr>
+          <w:rFonts w:ascii="Tahoma" w:hAnsi="Tahoma" w:cs="Tahoma"/>
+          <w:b w:val="0"/>
+          <w:i w:val="0"/>
+          <w:sz w:val="22"/>
+          <w:szCs w:val="22"/>
+        </w:rPr>
+        <w:t>یعنی چه؟ wildcard ‏0.0.0.127 فقط ۱۲۸ آدرس اول شبکه (*.0.28.0 تا *.0.28.127) را می‌گیرد، درحالی‌که اینترفیس LAN شبکه /24 است (*.0.28.0 تا *.0.28.255). مثال:</w:t>
+      </w:r>
+    </w:p>
+    <w:p>
+      <w:pPr>
+        <w:bidi w:val="1"/>
+        <w:spacing w:before="40" w:after="40" w:line="324" w:lineRule="auto"/>
+        <w:jc w:val="right"/>
+      </w:pPr>
+      <w:r>
+        <w:rPr>
+          <w:rFonts w:ascii="Tahoma" w:hAnsi="Tahoma" w:cs="Tahoma"/>
+          <w:b w:val="0"/>
+          <w:i w:val="0"/>
+          <w:sz w:val="22"/>
+          <w:szCs w:val="22"/>
+        </w:rPr>
+        <w:t>• هاست *.0.28.50 ← داخل رنج نات هست: موقع رفتن به گام سورسش 33.1.0.28 و به گام/سمش سمنان 44.1.0.28 می‌شود. مشکلی ندارد.</w:t>
+      </w:r>
+    </w:p>
+    <w:p>
+      <w:pPr>
+        <w:bidi w:val="1"/>
+        <w:spacing w:before="40" w:after="60" w:line="324" w:lineRule="auto"/>
+        <w:jc w:val="right"/>
+      </w:pPr>
+      <w:r>
+        <w:rPr>
+          <w:rFonts w:ascii="Tahoma" w:hAnsi="Tahoma" w:cs="Tahoma"/>
+          <w:b w:val="0"/>
+          <w:i w:val="0"/>
+          <w:sz w:val="22"/>
+          <w:szCs w:val="22"/>
+        </w:rPr>
+        <w:t>• هاست *.0.28.200 ← از LAN-ACL رد می‌شود (در LAN-ACL هر دو مقصد *.26.50.1 و *.20.59.8 با رنج کامل /24 یعنی 0.0.0.255 مجاز شده‌اند، خطوط 1272 و 1273) و بسته وارد تانل می‌شود، اما ACL نات آن را نمی‌گیرد؛ پس سورسش همان *.0.28.200 می‌ماند و بدون NAT به سرور می‌رسد. سمت سمنان/مرکز منتظر IP تانل (33.1.0.28 / 44.1.0.28) است، نه IP داخلی LAN؛ برای همین به‌احتمال زیاد جواب برنمی‌گردد و ارتباط آن هاست با گام و سمش برقرار نمی‌شود.</w:t>
+      </w:r>
+    </w:p>
+    <w:p>
+      <w:pPr>
+        <w:bidi w:val="1"/>
+        <w:spacing w:before="40" w:after="60" w:line="324" w:lineRule="auto"/>
+        <w:jc w:val="right"/>
+      </w:pPr>
+      <w:r>
+        <w:rPr>
+          <w:rFonts w:ascii="Tahoma" w:hAnsi="Tahoma" w:cs="Tahoma"/>
+          <w:b w:val="0"/>
+          <w:i w:val="0"/>
+          <w:sz w:val="22"/>
+          <w:szCs w:val="22"/>
+        </w:rPr>
+        <w:t>کدام طرف اشتباه است؟ دو حالت دارد: یا LAN واقعاً فقط نیمه اول (‏/25) است — در آن صورت ماسک اینترفیس و LAN-ACL باید /25 شوند و نباید هیچ هاست فعالی بین *.0.28.128 تا *.0.28.254 باشد (در چند ACL مسیریابی همین روتر هم /25 تکرار شده) — یا LAN ‏/24 است و ACLهای GAM/GAM2 اشتباهاً /25 مانده‌اند. پس قدم اول: از روی ARP/DHCP مشخص شود در نیمه دوم هاست فعالی هست یا نه.</w:t>
+      </w:r>
+    </w:p>
+    <w:p>
+      <w:pPr>
+        <w:bidi w:val="1"/>
+        <w:spacing w:before="40" w:after="20" w:line="324" w:lineRule="auto"/>
+        <w:jc w:val="right"/>
+      </w:pPr>
+      <w:r>
+        <w:rPr>
+          <w:rFonts w:ascii="Tahoma" w:hAnsi="Tahoma" w:cs="Tahoma"/>
+          <w:b/>
+          <w:i w:val="0"/>
+          <w:sz w:val="22"/>
+          <w:szCs w:val="22"/>
+        </w:rPr>
+        <w:t>اصلاح پیشنهادی (اگر LAN ‏/24 است):</w:t>
+      </w:r>
+    </w:p>
+    <w:p>
+      <w:pPr>
+        <w:bidi w:val="1"/>
+        <w:spacing w:before="40" w:after="20" w:line="324" w:lineRule="auto"/>
+        <w:jc w:val="right"/>
+      </w:pPr>
+      <w:r>
+        <w:rPr>
+          <w:rFonts w:ascii="Consolas" w:hAnsi="Consolas" w:cs="Consolas"/>
+          <w:b w:val="0"/>
+          <w:i w:val="0"/>
+          <w:sz w:val="19"/>
+          <w:szCs w:val="19"/>
+          <w:rtl w:val="0"/>
+        </w:rPr>
+        <w:t>ip access-list extended GAM</w:t>
+      </w:r>
+    </w:p>
+    <w:p>
+      <w:pPr>
+        <w:bidi w:val="1"/>
+        <w:spacing w:before="40" w:after="20" w:line="324" w:lineRule="auto"/>
+        <w:jc w:val="right"/>
+      </w:pPr>
+      <w:r>
+        <w:rPr>
+          <w:rFonts w:ascii="Consolas" w:hAnsi="Consolas" w:cs="Consolas"/>
+          <w:b w:val="0"/>
+          <w:i w:val="0"/>
+          <w:sz w:val="19"/>
+          <w:szCs w:val="19"/>
+          <w:rtl w:val="0"/>
+        </w:rPr>
+        <w:t xml:space="preserve"> permit ip *.0.28.0 0.0.0.255 host *.20.30.194</w:t>
+      </w:r>
+    </w:p>
+    <w:p>
+      <w:pPr>
+        <w:bidi w:val="1"/>
+        <w:spacing w:before="40" w:after="20" w:line="324" w:lineRule="auto"/>
+        <w:jc w:val="right"/>
+      </w:pPr>
+      <w:r>
+        <w:rPr>
+          <w:rFonts w:ascii="Consolas" w:hAnsi="Consolas" w:cs="Consolas"/>
+          <w:b w:val="0"/>
+          <w:i w:val="0"/>
+          <w:sz w:val="19"/>
+          <w:szCs w:val="19"/>
+          <w:rtl w:val="0"/>
+        </w:rPr>
+        <w:t>ip access-list extended GAM2</w:t>
+      </w:r>
+    </w:p>
+    <w:p>
+      <w:pPr>
+        <w:bidi w:val="1"/>
+        <w:spacing w:before="40" w:after="20" w:line="324" w:lineRule="auto"/>
+        <w:jc w:val="right"/>
+      </w:pPr>
+      <w:r>
+        <w:rPr>
+          <w:rFonts w:ascii="Consolas" w:hAnsi="Consolas" w:cs="Consolas"/>
+          <w:b w:val="0"/>
+          <w:i w:val="0"/>
+          <w:sz w:val="19"/>
+          <w:szCs w:val="19"/>
+          <w:rtl w:val="0"/>
+        </w:rPr>
+        <w:t xml:space="preserve"> permit ip *.0.28.0 0.0.0.255 host *.26.50.1</w:t>
+      </w:r>
+    </w:p>
+    <w:p>
+      <w:pPr>
+        <w:bidi w:val="1"/>
+        <w:spacing w:before="40" w:after="120" w:line="324" w:lineRule="auto"/>
+        <w:jc w:val="right"/>
+      </w:pPr>
+      <w:r>
+        <w:rPr>
+          <w:rFonts w:ascii="Consolas" w:hAnsi="Consolas" w:cs="Consolas"/>
+          <w:b w:val="0"/>
+          <w:i w:val="0"/>
+          <w:sz w:val="19"/>
+          <w:szCs w:val="19"/>
+          <w:rtl w:val="0"/>
+        </w:rPr>
+        <w:t xml:space="preserve"> permit ip *.0.28.0 0.0.0.255 host *.20.59.8</w:t>
       </w:r>
     </w:p>
     <w:p>

</xml_diff>